<commit_message>
feat: Introduce new administrative templates, server scripts, public website content, and product documentation.
</commit_message>
<xml_diff>
--- a/GSO WORD FILE.docx
+++ b/GSO WORD FILE.docx
@@ -4,24 +4,26 @@
   <w:body>
     <w:p>
       <w:pPr>
-        <w:tabs>
-          <w:tab w:val="left" w:pos="3945"/>
-        </w:tabs>
-        <w:rPr>
-          <w:sz w:val="12"/>
-          <w:szCs w:val="12"/>
-        </w:rPr>
-      </w:pPr>
-      <w:r>
-        <w:rPr>
-          <w:sz w:val="12"/>
-          <w:szCs w:val="12"/>
-        </w:rPr>
+        <w:jc w:val="center"/>
+        <w:rPr>
+          <w:rFonts w:ascii="Arial" w:hAnsi="Arial" w:cs="Arial"/>
+          <w:sz w:val="16"/>
+        </w:rPr>
+      </w:pPr>
+      <w:r>
         <w:drawing>
-          <wp:inline distT="0" distB="0" distL="0" distR="0">
-            <wp:extent cx="2007235" cy="616585"/>
-            <wp:effectExtent l="0" t="0" r="0" b="0"/>
-            <wp:docPr id="2016215547" name="Picture 3" descr="C:/Users/U/Downloads/RAM-logo-2009-2560x1440.pngRAM-logo-2009-2560x1440"/>
+          <wp:anchor distT="0" distB="0" distL="114300" distR="114300" simplePos="0" relativeHeight="251663360" behindDoc="1" locked="0" layoutInCell="1" allowOverlap="1">
+            <wp:simplePos x="0" y="0"/>
+            <wp:positionH relativeFrom="margin">
+              <wp:posOffset>-6985</wp:posOffset>
+            </wp:positionH>
+            <wp:positionV relativeFrom="paragraph">
+              <wp:posOffset>100330</wp:posOffset>
+            </wp:positionV>
+            <wp:extent cx="1037590" cy="841375"/>
+            <wp:effectExtent l="0" t="0" r="10160" b="0"/>
+            <wp:wrapNone/>
+            <wp:docPr id="2" name="Picture 2"/>
             <wp:cNvGraphicFramePr>
               <a:graphicFrameLocks xmlns:a="http://schemas.openxmlformats.org/drawingml/2006/main" noChangeAspect="1"/>
             </wp:cNvGraphicFramePr>
@@ -29,14 +31,20 @@
               <a:graphicData uri="http://schemas.openxmlformats.org/drawingml/2006/picture">
                 <pic:pic xmlns:pic="http://schemas.openxmlformats.org/drawingml/2006/picture">
                   <pic:nvPicPr>
-                    <pic:cNvPr id="2016215547" name="Picture 3" descr="C:/Users/U/Downloads/RAM-logo-2009-2560x1440.pngRAM-logo-2009-2560x1440"/>
+                    <pic:cNvPr id="2" name="Picture 2"/>
                     <pic:cNvPicPr>
-                      <a:picLocks noChangeAspect="1"/>
+                      <a:picLocks noChangeAspect="1" noChangeArrowheads="1"/>
                     </pic:cNvPicPr>
                   </pic:nvPicPr>
                   <pic:blipFill>
-                    <a:blip r:embed="rId6"/>
-                    <a:srcRect t="22699" b="22699"/>
+                    <a:blip r:embed="rId6">
+                      <a:extLst>
+                        <a:ext uri="{28A0092B-C50C-407E-A947-70E740481C1C}">
+                          <a14:useLocalDpi xmlns:a14="http://schemas.microsoft.com/office/drawing/2010/main" val="0"/>
+                        </a:ext>
+                      </a:extLst>
+                    </a:blip>
+                    <a:srcRect/>
                     <a:stretch>
                       <a:fillRect/>
                     </a:stretch>
@@ -44,48 +52,149 @@
                   <pic:spPr>
                     <a:xfrm>
                       <a:off x="0" y="0"/>
-                      <a:ext cx="2007235" cy="616585"/>
+                      <a:ext cx="1037590" cy="841375"/>
                     </a:xfrm>
                     <a:prstGeom prst="rect">
                       <a:avLst/>
                     </a:prstGeom>
+                    <a:noFill/>
                   </pic:spPr>
                 </pic:pic>
               </a:graphicData>
             </a:graphic>
-          </wp:inline>
+          </wp:anchor>
         </w:drawing>
       </w:r>
       <w:r>
         <w:rPr>
+          <w:rFonts w:hint="default"/>
           <w:sz w:val="12"/>
           <w:szCs w:val="12"/>
-        </w:rPr>
-        <w:tab/>
-      </w:r>
-      <w:r>
-        <w:rPr>
+          <w:lang w:val="en-US"/>
+        </w:rPr>
+        <w:t xml:space="preserve">        </w:t>
+      </w:r>
+      <w:r>
+        <w:rPr>
+          <w:rFonts w:ascii="Arial Black" w:hAnsi="Arial Black"/>
+          <w:b/>
+          <w:color w:val="FF0000"/>
+          <w:sz w:val="36"/>
+          <w:szCs w:val="36"/>
+        </w:rPr>
+        <w:t>TOYOTA</w:t>
+      </w:r>
+    </w:p>
+    <w:p>
+      <w:pPr>
+        <w:jc w:val="center"/>
+        <w:rPr>
+          <w:rFonts w:ascii="Arial Black" w:hAnsi="Arial Black"/>
+          <w:b/>
+          <w:sz w:val="36"/>
+          <w:szCs w:val="36"/>
+        </w:rPr>
+      </w:pPr>
+      <w:r>
+        <w:rPr>
+          <w:b/>
+        </w:rPr>
+        <w:t>TOYOTA MOTOR CORPORATION</w:t>
+      </w:r>
+    </w:p>
+    <w:p>
+      <w:pPr>
+        <w:tabs>
+          <w:tab w:val="center" w:pos="5233"/>
+          <w:tab w:val="left" w:pos="9636"/>
+        </w:tabs>
+        <w:rPr>
+          <w:b/>
+          <w:sz w:val="18"/>
+          <w:szCs w:val="18"/>
+        </w:rPr>
+      </w:pPr>
+      <w:r>
+        <w:rPr>
+          <w:b/>
           <w:sz w:val="12"/>
           <w:szCs w:val="12"/>
         </w:rPr>
-        <w:t xml:space="preserve">                                                                                                                                                                        </w:t>
+        <w:tab/>
+      </w:r>
+      <w:r>
+        <w:rPr>
+          <w:b/>
+          <w:sz w:val="12"/>
+          <w:szCs w:val="12"/>
+        </w:rPr>
+        <w:t>I. TOYOTA-CHO TOYOTA. AICHI, 471—8571(HEAD OFFICE)</w:t>
+      </w:r>
+      <w:r>
+        <w:t xml:space="preserve"> </w:t>
       </w:r>
     </w:p>
     <w:p>
       <w:pPr>
         <w:tabs>
-          <w:tab w:val="left" w:pos="303"/>
-          <w:tab w:val="left" w:pos="3497"/>
-          <w:tab w:val="left" w:pos="3533"/>
-          <w:tab w:val="center" w:pos="5400"/>
+          <w:tab w:val="center" w:pos="5233"/>
+          <w:tab w:val="left" w:pos="9336"/>
         </w:tabs>
-        <w:jc w:val="right"/>
+        <w:rPr>
+          <w:b/>
+          <w:sz w:val="12"/>
+          <w:szCs w:val="12"/>
+        </w:rPr>
+      </w:pPr>
+      <w:r>
+        <w:rPr>
+          <w:b/>
+          <w:sz w:val="12"/>
+          <w:szCs w:val="12"/>
+        </w:rPr>
+        <w:tab/>
+      </w:r>
+      <w:r>
+        <w:rPr>
+          <w:b/>
+          <w:sz w:val="12"/>
+          <w:szCs w:val="12"/>
+        </w:rPr>
+        <w:t>or 471 8572 (Research 5 Development Group) THAILAND</w:t>
+      </w:r>
+      <w:r>
+        <w:rPr>
+          <w:b/>
+          <w:sz w:val="12"/>
+          <w:szCs w:val="12"/>
+        </w:rPr>
+        <w:tab/>
+      </w:r>
+    </w:p>
+    <w:p>
+      <w:pPr>
+        <w:jc w:val="center"/>
         <w:rPr>
           <w:b/>
           <w:sz w:val="16"/>
           <w:szCs w:val="16"/>
         </w:rPr>
       </w:pPr>
+      <w:r>
+        <w:rPr>
+          <w:b/>
+          <w:sz w:val="12"/>
+          <w:szCs w:val="12"/>
+        </w:rPr>
+        <w:t>TEL: +81-565-28-212</w:t>
+      </w:r>
+      <w:r>
+        <w:rPr>
+          <w:sz w:val="12"/>
+          <w:szCs w:val="12"/>
+        </w:rPr>
+        <w:t xml:space="preserve">                                                                                                                                                          </w:t>
+      </w:r>
       <w:r>
         <mc:AlternateContent>
           <mc:Choice Requires="wps">
@@ -175,13 +284,13 @@
             <wp:extent cx="843915" cy="843915"/>
             <wp:effectExtent l="0" t="0" r="13335" b="13335"/>
             <wp:wrapNone/>
-            <wp:docPr id="5" name="image2.jpg" descr="C:/Users/U/Downloads/rebel.pngrebel"/>
+            <wp:docPr id="5" name="image2.jpg" descr="C:/Users/U/Downloads/TOYOTA LAND CRUISER GXR V6 4.0L SUV 4WD 5Doors.pngTOYOTA LAND CRUISER GXR V6 4.0L SUV 4WD 5Doors"/>
             <wp:cNvGraphicFramePr/>
             <a:graphic xmlns:a="http://schemas.openxmlformats.org/drawingml/2006/main">
               <a:graphicData uri="http://schemas.openxmlformats.org/drawingml/2006/picture">
                 <pic:pic xmlns:pic="http://schemas.openxmlformats.org/drawingml/2006/picture">
                   <pic:nvPicPr>
-                    <pic:cNvPr id="5" name="image2.jpg" descr="C:/Users/U/Downloads/rebel.pngrebel"/>
+                    <pic:cNvPr id="5" name="image2.jpg" descr="C:/Users/U/Downloads/TOYOTA LAND CRUISER GXR V6 4.0L SUV 4WD 5Doors.pngTOYOTA LAND CRUISER GXR V6 4.0L SUV 4WD 5Doors"/>
                     <pic:cNvPicPr preferRelativeResize="0"/>
                   </pic:nvPicPr>
                   <pic:blipFill>
@@ -269,17 +378,7 @@
           <w:sz w:val="28"/>
           <w:szCs w:val="28"/>
         </w:rPr>
-        <w:t>56762</w:t>
-      </w:r>
-      <w:r>
-        <w:rPr>
-          <w:rFonts w:hint="default"/>
-          <w:b/>
-          <w:sz w:val="28"/>
-          <w:szCs w:val="28"/>
-          <w:lang w:val="en-US"/>
-        </w:rPr>
-        <w:t>8</w:t>
+        <w:t>530361</w:t>
       </w:r>
     </w:p>
     <w:p>
@@ -333,7 +432,7 @@
           <w:sz w:val="18"/>
           <w:szCs w:val="18"/>
         </w:rPr>
-        <w:t>FCA US LLC</w:t>
+        <w:t>Toyota Motor Corporation</w:t>
       </w:r>
     </w:p>
     <w:p>
@@ -359,7 +458,7 @@
           <w:sz w:val="18"/>
           <w:szCs w:val="18"/>
         </w:rPr>
-        <w:t>CANADA</w:t>
+        <w:t>JAPAN</w:t>
       </w:r>
       <w:r>
         <w:rPr>
@@ -383,7 +482,7 @@
           <w:sz w:val="18"/>
           <w:szCs w:val="18"/>
         </w:rPr>
-        <w:t>CANADA</w:t>
+        <w:t>JAPAN</w:t>
       </w:r>
     </w:p>
     <w:p>
@@ -433,7 +532,7 @@
           <w:sz w:val="18"/>
           <w:szCs w:val="18"/>
         </w:rPr>
-        <w:t>FCA US LLC</w:t>
+        <w:t>Toyota Motor Corporation</w:t>
       </w:r>
     </w:p>
     <w:p>
@@ -474,31 +573,32 @@
           <w:sz w:val="18"/>
           <w:szCs w:val="18"/>
         </w:rPr>
-        <w:t>RAM 1500 SST Rebel X 3.0L Pick-up 4×4 4Door</w:t>
-      </w:r>
-      <w:r>
-        <w:rPr>
-          <w:rFonts w:hint="default"/>
-          <w:sz w:val="18"/>
-          <w:szCs w:val="18"/>
-        </w:rPr>
-        <w:t>s</w:t>
-      </w:r>
-    </w:p>
-    <w:p>
-      <w:pPr>
-        <w:rPr>
-          <w:b/>
-          <w:sz w:val="18"/>
-          <w:szCs w:val="18"/>
-        </w:rPr>
-      </w:pPr>
-      <w:r>
-        <w:rPr>
-          <w:sz w:val="18"/>
-          <w:szCs w:val="18"/>
-        </w:rPr>
-        <w:t>* VlN number:</w:t>
+        <w:t>TOYOTA LAND CRUISER GXR V6 4.0L SUV 4WD 5Doors</w:t>
+      </w:r>
+    </w:p>
+    <w:p>
+      <w:pPr>
+        <w:rPr>
+          <w:b/>
+          <w:sz w:val="18"/>
+          <w:szCs w:val="18"/>
+        </w:rPr>
+      </w:pPr>
+      <w:r>
+        <w:rPr>
+          <w:sz w:val="18"/>
+          <w:szCs w:val="18"/>
+        </w:rPr>
+        <w:t xml:space="preserve">* VlN number: </w:t>
+      </w:r>
+      <w:r>
+        <w:rPr>
+          <w:b/>
+          <w:bCs/>
+          <w:sz w:val="18"/>
+          <w:szCs w:val="18"/>
+        </w:rPr>
+        <w:t>JTMAUCBJ*S*******</w:t>
       </w:r>
       <w:r>
         <w:rPr>
@@ -508,6 +608,8 @@
         </w:rPr>
         <w:tab/>
       </w:r>
+      <w:bookmarkStart w:id="0" w:name="_GoBack"/>
+      <w:bookmarkEnd w:id="0"/>
     </w:p>
     <w:p>
       <w:pPr>
@@ -560,7 +662,7 @@
           <w:sz w:val="18"/>
           <w:szCs w:val="18"/>
         </w:rPr>
-        <w:t>07</w:t>
+        <w:t>6</w:t>
       </w:r>
       <w:r>
         <w:rPr>
@@ -601,7 +703,7 @@
           <w:sz w:val="18"/>
           <w:szCs w:val="18"/>
         </w:rPr>
-        <w:t>Truck</w:t>
+        <w:t>SUV</w:t>
       </w:r>
     </w:p>
     <w:p>
@@ -685,7 +787,7 @@
           <w:szCs w:val="18"/>
           <w:lang w:val="en-US"/>
         </w:rPr>
-        <w:t>3450</w:t>
+        <w:t>3350</w:t>
       </w:r>
       <w:r>
         <w:rPr>
@@ -721,7 +823,7 @@
           <w:szCs w:val="18"/>
           <w:lang w:val="en-US"/>
         </w:rPr>
-        <w:t xml:space="preserve">2550 </w:t>
+        <w:t xml:space="preserve">2580 </w:t>
       </w:r>
       <w:r>
         <w:rPr>
@@ -765,7 +867,7 @@
           <w:szCs w:val="18"/>
           <w:lang w:val="en-US"/>
         </w:rPr>
-        <w:t xml:space="preserve">1750 </w:t>
+        <w:t xml:space="preserve">1580 </w:t>
       </w:r>
       <w:r>
         <w:rPr>
@@ -791,7 +893,7 @@
           <w:szCs w:val="18"/>
           <w:lang w:val="en-US"/>
         </w:rPr>
-        <w:t xml:space="preserve">1900 </w:t>
+        <w:t xml:space="preserve">1950 </w:t>
       </w:r>
       <w:r>
         <w:rPr>
@@ -841,7 +943,7 @@
           <w:szCs w:val="18"/>
           <w:lang w:val="en-US"/>
         </w:rPr>
-        <w:t xml:space="preserve">5916 </w:t>
+        <w:t xml:space="preserve">5145 </w:t>
       </w:r>
       <w:r>
         <w:rPr>
@@ -867,7 +969,7 @@
           <w:szCs w:val="18"/>
           <w:lang w:val="en-US"/>
         </w:rPr>
-        <w:t xml:space="preserve">2085 </w:t>
+        <w:t xml:space="preserve">1980 </w:t>
       </w:r>
       <w:r>
         <w:rPr>
@@ -909,7 +1011,7 @@
           <w:szCs w:val="18"/>
           <w:lang w:val="en-US"/>
         </w:rPr>
-        <w:t xml:space="preserve">1960 </w:t>
+        <w:t xml:space="preserve">1890 </w:t>
       </w:r>
       <w:r>
         <w:rPr>
@@ -935,7 +1037,7 @@
           <w:szCs w:val="18"/>
           <w:lang w:val="en-US"/>
         </w:rPr>
-        <w:t xml:space="preserve">3692 </w:t>
+        <w:t xml:space="preserve">2850 </w:t>
       </w:r>
       <w:r>
         <w:rPr>
@@ -961,7 +1063,7 @@
           <w:szCs w:val="18"/>
           <w:lang w:val="en-US"/>
         </w:rPr>
-        <w:t xml:space="preserve">1740 </w:t>
+        <w:t xml:space="preserve">1665 </w:t>
       </w:r>
       <w:r>
         <w:rPr>
@@ -987,7 +1089,7 @@
           <w:szCs w:val="18"/>
           <w:lang w:val="en-US"/>
         </w:rPr>
-        <w:t xml:space="preserve">1740 </w:t>
+        <w:t xml:space="preserve">1665 </w:t>
       </w:r>
       <w:r>
         <w:rPr>
@@ -1024,8 +1126,6 @@
         </w:rPr>
         <w:t>Body-on-frame</w:t>
       </w:r>
-      <w:bookmarkStart w:id="0" w:name="_GoBack"/>
-      <w:bookmarkEnd w:id="0"/>
     </w:p>
     <w:p>
       <w:pPr>
@@ -1051,7 +1151,7 @@
           <w:szCs w:val="18"/>
           <w:lang w:val="en-US"/>
         </w:rPr>
-        <w:t>5</w:t>
+        <w:t>7</w:t>
       </w:r>
       <w:r>
         <w:rPr>
@@ -1160,7 +1260,7 @@
           <w:szCs w:val="18"/>
           <w:lang w:val="en-US"/>
         </w:rPr>
-        <w:t>2993</w:t>
+        <w:t>3982</w:t>
       </w:r>
       <w:r>
         <w:rPr>
@@ -1195,17 +1295,7 @@
           <w:szCs w:val="18"/>
           <w:lang w:val="en-US"/>
         </w:rPr>
-        <w:t xml:space="preserve">Twin </w:t>
-      </w:r>
-      <w:r>
-        <w:rPr>
-          <w:rFonts w:hint="default"/>
-          <w:b/>
-          <w:bCs/>
-          <w:sz w:val="18"/>
-          <w:szCs w:val="18"/>
-        </w:rPr>
-        <w:t>Turbo</w:t>
+        <w:t>Naturally Aspirated</w:t>
       </w:r>
     </w:p>
     <w:p>
@@ -1230,7 +1320,7 @@
           <w:sz w:val="18"/>
           <w:szCs w:val="18"/>
         </w:rPr>
-        <w:t>313</w:t>
+        <w:t>202</w:t>
       </w:r>
       <w:r>
         <w:rPr>
@@ -1293,7 +1383,7 @@
           <w:sz w:val="18"/>
           <w:szCs w:val="18"/>
         </w:rPr>
-        <w:t>5200</w:t>
+        <w:t>5600</w:t>
       </w:r>
       <w:r>
         <w:rPr>
@@ -1455,7 +1545,7 @@
           <w:sz w:val="18"/>
           <w:szCs w:val="18"/>
         </w:rPr>
-        <w:t>Combined with the service brakes</w:t>
+        <w:t>Combined with the service brake</w:t>
       </w:r>
     </w:p>
     <w:p>
@@ -1491,7 +1581,7 @@
           <w:sz w:val="18"/>
           <w:szCs w:val="18"/>
         </w:rPr>
-        <w:t>Light Truck</w:t>
+        <w:t>SUV</w:t>
       </w:r>
       <w:r>
         <w:rPr>
@@ -1552,7 +1642,7 @@
           <w:szCs w:val="18"/>
           <w:lang w:val="en-US"/>
         </w:rPr>
-        <w:t>5</w:t>
+        <w:t>7</w:t>
       </w:r>
       <w:r>
         <w:rPr>
@@ -1587,49 +1677,30 @@
           <w:szCs w:val="18"/>
           <w:lang w:val="en-US"/>
         </w:rPr>
-        <w:t>Poor</w:t>
-      </w:r>
-    </w:p>
-    <w:p>
-      <w:pPr>
-        <w:rPr>
-          <w:sz w:val="18"/>
-          <w:szCs w:val="18"/>
-        </w:rPr>
-      </w:pPr>
-      <w:r>
-        <w:rPr>
-          <w:sz w:val="18"/>
-          <w:szCs w:val="18"/>
-        </w:rPr>
-        <w:t xml:space="preserve"> 9. Any other information or local standards to be compiled: Also comply with the National regulations for member countries mentioned in the Annex of the list of Technical Regulations for MV 2025 MY-D3, when exporting to those countries.                              </w:t>
-      </w:r>
-    </w:p>
-    <w:p>
-      <w:pPr>
-        <w:jc w:val="center"/>
-        <w:rPr>
-          <w:sz w:val="18"/>
-          <w:szCs w:val="18"/>
-        </w:rPr>
-      </w:pPr>
-      <w:r>
-        <w:rPr>
-          <w:sz w:val="18"/>
-          <w:szCs w:val="18"/>
-        </w:rPr>
-        <w:t xml:space="preserve">                                                                                                      </w:t>
-      </w:r>
-      <w:r>
-        <w:rPr>
-          <w:sz w:val="18"/>
-          <w:szCs w:val="18"/>
-        </w:rPr>
+        <w:t>Good</w:t>
+      </w:r>
+    </w:p>
+    <w:p>
+      <w:pPr>
+        <w:rPr>
+          <w:sz w:val="18"/>
+          <w:szCs w:val="18"/>
+        </w:rPr>
+      </w:pPr>
+      <w:r>
         <w:drawing>
-          <wp:inline distT="0" distB="0" distL="0" distR="0">
-            <wp:extent cx="1938655" cy="1059815"/>
-            <wp:effectExtent l="0" t="0" r="0" b="0"/>
-            <wp:docPr id="1168502314" name="Picture 4" descr="C:/Users/U/Downloads/sig.pngsig"/>
+          <wp:anchor distT="0" distB="0" distL="114300" distR="114300" simplePos="0" relativeHeight="251664384" behindDoc="1" locked="0" layoutInCell="1" allowOverlap="1">
+            <wp:simplePos x="0" y="0"/>
+            <wp:positionH relativeFrom="column">
+              <wp:posOffset>4643120</wp:posOffset>
+            </wp:positionH>
+            <wp:positionV relativeFrom="paragraph">
+              <wp:posOffset>319405</wp:posOffset>
+            </wp:positionV>
+            <wp:extent cx="1400175" cy="1437640"/>
+            <wp:effectExtent l="0" t="0" r="9525" b="10160"/>
+            <wp:wrapNone/>
+            <wp:docPr id="10" name="Picture 10"/>
             <wp:cNvGraphicFramePr>
               <a:graphicFrameLocks xmlns:a="http://schemas.openxmlformats.org/drawingml/2006/main" noChangeAspect="1"/>
             </wp:cNvGraphicFramePr>
@@ -1637,14 +1708,20 @@
               <a:graphicData uri="http://schemas.openxmlformats.org/drawingml/2006/picture">
                 <pic:pic xmlns:pic="http://schemas.openxmlformats.org/drawingml/2006/picture">
                   <pic:nvPicPr>
-                    <pic:cNvPr id="1168502314" name="Picture 4" descr="C:/Users/U/Downloads/sig.pngsig"/>
+                    <pic:cNvPr id="10" name="Picture 10"/>
                     <pic:cNvPicPr>
                       <a:picLocks noChangeAspect="1" noChangeArrowheads="1"/>
                     </pic:cNvPicPr>
                   </pic:nvPicPr>
                   <pic:blipFill>
-                    <a:blip r:embed="rId9"/>
-                    <a:srcRect t="9008" b="9008"/>
+                    <a:blip r:embed="rId9">
+                      <a:extLst>
+                        <a:ext uri="{28A0092B-C50C-407E-A947-70E740481C1C}">
+                          <a14:useLocalDpi xmlns:a14="http://schemas.microsoft.com/office/drawing/2010/main" val="0"/>
+                        </a:ext>
+                      </a:extLst>
+                    </a:blip>
+                    <a:srcRect/>
                     <a:stretch>
                       <a:fillRect/>
                     </a:stretch>
@@ -1652,22 +1729,35 @@
                   <pic:spPr>
                     <a:xfrm>
                       <a:off x="0" y="0"/>
-                      <a:ext cx="1938655" cy="1070629"/>
+                      <a:ext cx="1400175" cy="1437640"/>
                     </a:xfrm>
                     <a:prstGeom prst="rect">
                       <a:avLst/>
                     </a:prstGeom>
                     <a:noFill/>
-                    <a:ln>
-                      <a:noFill/>
-                    </a:ln>
                   </pic:spPr>
                 </pic:pic>
               </a:graphicData>
             </a:graphic>
-          </wp:inline>
+          </wp:anchor>
         </w:drawing>
       </w:r>
+      <w:r>
+        <w:rPr>
+          <w:sz w:val="18"/>
+          <w:szCs w:val="18"/>
+        </w:rPr>
+        <w:t xml:space="preserve"> 9. Any other information or local standards to be compiled: Also comply with the National regulations for member countries mentioned in the Annex of the list of Technical Regulations for MV 2025MY-D3, when exporting to those countries. for member countries mentioned in the Annex of the list of Technical Regulations for MV 2025 MY-D3, when exporting to those countries.                              </w:t>
+      </w:r>
+    </w:p>
+    <w:p>
+      <w:pPr>
+        <w:rPr>
+          <w:rFonts w:ascii="Arial" w:hAnsi="Arial" w:cs="Arial"/>
+          <w:sz w:val="24"/>
+          <w:szCs w:val="16"/>
+        </w:rPr>
+      </w:pPr>
       <w:r>
         <mc:AlternateContent>
           <mc:Choice Requires="wps">
@@ -1675,10 +1765,10 @@
               <wp:anchor distT="0" distB="0" distL="114300" distR="114300" simplePos="0" relativeHeight="251662336" behindDoc="0" locked="0" layoutInCell="1" allowOverlap="1">
                 <wp:simplePos x="0" y="0"/>
                 <wp:positionH relativeFrom="column">
-                  <wp:posOffset>393700</wp:posOffset>
+                  <wp:posOffset>386715</wp:posOffset>
                 </wp:positionH>
                 <wp:positionV relativeFrom="paragraph">
-                  <wp:posOffset>1162685</wp:posOffset>
+                  <wp:posOffset>1065530</wp:posOffset>
                 </wp:positionV>
                 <wp:extent cx="1184275" cy="282575"/>
                 <wp:effectExtent l="0" t="0" r="0" b="0"/>
@@ -1724,7 +1814,7 @@
                                 <w:sz w:val="24"/>
                                 <w:lang w:val="en-US"/>
                               </w:rPr>
-                              <w:t xml:space="preserve">17  SEP </w:t>
+                              <w:t xml:space="preserve">11 OCT </w:t>
                             </w:r>
                             <w:r>
                               <w:rPr>
@@ -1748,7 +1838,7 @@
           </mc:Choice>
           <mc:Fallback>
             <w:pict>
-              <v:rect id="Rectangle 1" o:spid="_x0000_s1026" o:spt="1" style="position:absolute;left:0pt;margin-left:31pt;margin-top:91.55pt;height:22.25pt;width:93.25pt;z-index:251662336;mso-width-relative:page;mso-height-relative:page;" fillcolor="#FFFFFF [3201]" filled="t" stroked="t" coordsize="21600,21600" o:gfxdata="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">
+              <v:rect id="Rectangle 1" o:spid="_x0000_s1026" o:spt="1" style="position:absolute;left:0pt;margin-left:30.45pt;margin-top:83.9pt;height:22.25pt;width:93.25pt;z-index:251662336;mso-width-relative:page;mso-height-relative:page;" fillcolor="#FFFFFF [3201]" filled="t" stroked="t" coordsize="21600,21600" o:gfxdata="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">
                 <v:fill on="t" focussize="0,0"/>
                 <v:stroke color="#FFFFFF [3201]" joinstyle="round" startarrowwidth="narrow" startarrowlength="short" endarrowwidth="narrow" endarrowlength="short"/>
                 <v:imagedata o:title=""/>
@@ -1767,7 +1857,7 @@
                           <w:sz w:val="24"/>
                           <w:lang w:val="en-US"/>
                         </w:rPr>
-                        <w:t xml:space="preserve">17  SEP </w:t>
+                        <w:t xml:space="preserve">11 OCT </w:t>
                       </w:r>
                       <w:r>
                         <w:rPr>
@@ -1790,12 +1880,69 @@
           <w:sz w:val="18"/>
           <w:szCs w:val="18"/>
         </w:rPr>
-        <w:t xml:space="preserve">                                                                                                                                                        </w:t>
+        <w:t xml:space="preserve">                                                                                 </w:t>
+      </w:r>
+      <w:r>
+        <w:rPr>
+          <w:rFonts w:ascii="Arial" w:hAnsi="Arial" w:cs="Arial"/>
+          <w:sz w:val="24"/>
+          <w:szCs w:val="16"/>
+        </w:rPr>
+        <w:t xml:space="preserve">     </w:t>
+      </w:r>
+      <w:r>
+        <w:rPr>
+          <w:rFonts w:hint="default" w:ascii="Arial" w:hAnsi="Arial" w:cs="Arial"/>
+          <w:sz w:val="24"/>
+          <w:szCs w:val="16"/>
+          <w:lang w:val="en-US"/>
+        </w:rPr>
+        <w:t xml:space="preserve">                                                             </w:t>
+      </w:r>
+      <w:r>
+        <w:rPr>
+          <w:rFonts w:ascii="Arial" w:hAnsi="Arial" w:cs="Arial"/>
+          <w:sz w:val="24"/>
+          <w:szCs w:val="16"/>
+        </w:rPr>
+        <w:t xml:space="preserve"> Keiko Yanagi</w:t>
+      </w:r>
+    </w:p>
+    <w:p>
+      <w:pPr>
+        <w:rPr>
+          <w:rFonts w:ascii="Arial" w:hAnsi="Arial" w:cs="Arial"/>
+          <w:sz w:val="20"/>
+          <w:szCs w:val="16"/>
+        </w:rPr>
+      </w:pPr>
+      <w:r>
+        <w:rPr>
+          <w:rFonts w:ascii="Arial" w:hAnsi="Arial" w:cs="Arial"/>
+          <w:sz w:val="16"/>
+        </w:rPr>
+        <w:t xml:space="preserve">                                                                                                                                                general Manager Regulation &amp;Certiﬁcation Division</w:t>
+      </w:r>
+    </w:p>
+    <w:p>
+      <w:pPr>
+        <w:jc w:val="center"/>
+        <w:rPr>
+          <w:sz w:val="18"/>
+          <w:szCs w:val="18"/>
+        </w:rPr>
+      </w:pPr>
+      <w:r>
+        <w:rPr>
+          <w:sz w:val="18"/>
+          <w:szCs w:val="18"/>
+        </w:rPr>
+        <w:t xml:space="preserve">                                                                                                                                                                             </w:t>
       </w:r>
     </w:p>
     <w:sectPr>
       <w:pgSz w:w="11906" w:h="16838"/>
-      <w:pgMar w:top="720" w:right="720" w:bottom="720" w:left="720" w:header="720" w:footer="720" w:gutter="0"/>
+      <w:pgMar w:top="40" w:right="720" w:bottom="720" w:left="720" w:header="720" w:footer="720" w:gutter="0"/>
       <w:pgNumType w:start="1"/>
       <w:cols w:space="720" w:num="1"/>
     </w:sectPr>

</xml_diff>